<commit_message>
docs(user-guide): adicionar screenshots reais ao guia do usuário PDF
- gerar-pdf.js: suporte a ![alt](path) via PDFKit doc.image() com fit e
  fallback placeholder quando imagem não encontrada
- capture-screenshots.spec.ts: 9 capturas Playwright salvas em
  docs/user-guide/images/ (login, signup, dashboard, library, review,
  active, skills, settings)
- user-guide.md: 6 placeholders substituídos por imagens reais
- PDF gerado com 712 KB (imagens embutidas)

Co-Authored-By: Claude Sonnet 4.6 <noreply@anthropic.com>
</commit_message>
<xml_diff>
--- a/docs/user-guide/user-guide.docx
+++ b/docs/user-guide/user-guide.docx
@@ -82,7 +82,7 @@
           <w:sz w:val="20"/>
           <w:szCs w:val="20"/>
         </w:rPr>
-        <w:t xml:space="preserve">Versão 2.0  ·  8 de junho de 2026</w:t>
+        <w:t xml:space="preserve">Versão 2.0  ·  9 de junho de 2026</w:t>
       </w:r>
     </w:p>
     <w:p>
@@ -1942,22 +1942,16 @@
     </w:p>
     <w:p>
       <w:pPr>
-        <w:pBdr>
-          <w:left w:color="7C3AED" w:sz="12" w:space="8"/>
-        </w:pBdr>
-        <w:spacing w:after="120" w:before="120"/>
-        <w:ind w:left="576"/>
-      </w:pPr>
-      <w:r>
-        <w:rPr>
-          <w:rFonts w:ascii="Calibri" w:cs="Calibri" w:eastAsia="Calibri" w:hAnsi="Calibri"/>
-          <w:i/>
-          <w:iCs/>
-          <w:color w:val="64748B"/>
-          <w:sz w:val="22"/>
-          <w:szCs w:val="22"/>
-        </w:rPr>
-        <w:t xml:space="preserve">📸 *[Imagem: Dashboard completo com saudação, métricas, revisões do dia e heatmap de atividade]*</w:t>
+        <w:spacing w:after="80" w:before="80"/>
+      </w:pPr>
+      <w:r>
+        <w:rPr>
+          <w:rFonts w:ascii="Calibri" w:cs="Calibri" w:eastAsia="Calibri" w:hAnsi="Calibri"/>
+          <w:color w:val="1E293B"/>
+          <w:sz w:val="22"/>
+          <w:szCs w:val="22"/>
+        </w:rPr>
+        <w:t xml:space="preserve">![Dashboard — central de aprendizagem do NeuroLearn](images/03-dashboard.png)</w:t>
       </w:r>
     </w:p>
     <w:p>
@@ -3260,22 +3254,16 @@
     </w:p>
     <w:p>
       <w:pPr>
-        <w:pBdr>
-          <w:left w:color="7C3AED" w:sz="12" w:space="8"/>
-        </w:pBdr>
-        <w:spacing w:after="120" w:before="120"/>
-        <w:ind w:left="576"/>
-      </w:pPr>
-      <w:r>
-        <w:rPr>
-          <w:rFonts w:ascii="Calibri" w:cs="Calibri" w:eastAsia="Calibri" w:hAnsi="Calibri"/>
-          <w:i/>
-          <w:iCs/>
-          <w:color w:val="64748B"/>
-          <w:sz w:val="22"/>
-          <w:szCs w:val="22"/>
-        </w:rPr>
-        <w:t xml:space="preserve">📸 *[Imagem: Biblioteca com cards de conteúdo listados, botão "Adicionar conteúdo" no topo]*</w:t>
+        <w:spacing w:after="80" w:before="80"/>
+      </w:pPr>
+      <w:r>
+        <w:rPr>
+          <w:rFonts w:ascii="Calibri" w:cs="Calibri" w:eastAsia="Calibri" w:hAnsi="Calibri"/>
+          <w:color w:val="1E293B"/>
+          <w:sz w:val="22"/>
+          <w:szCs w:val="22"/>
+        </w:rPr>
+        <w:t xml:space="preserve">![Biblioteca de conteúdos do NeuroLearn](images/04-library.png)</w:t>
       </w:r>
     </w:p>
     <w:p>
@@ -5301,22 +5289,16 @@
     </w:p>
     <w:p>
       <w:pPr>
-        <w:pBdr>
-          <w:left w:color="7C3AED" w:sz="12" w:space="8"/>
-        </w:pBdr>
-        <w:spacing w:after="120" w:before="120"/>
-        <w:ind w:left="576"/>
-      </w:pPr>
-      <w:r>
-        <w:rPr>
-          <w:rFonts w:ascii="Calibri" w:cs="Calibri" w:eastAsia="Calibri" w:hAnsi="Calibri"/>
-          <w:i/>
-          <w:iCs/>
-          <w:color w:val="64748B"/>
-          <w:sz w:val="22"/>
-          <w:szCs w:val="22"/>
-        </w:rPr>
-        <w:t xml:space="preserve">📸 *[Imagem: Tela de revisão com flashcard na frente, botão "Revelar" e avaliadores visíveis]*</w:t>
+        <w:spacing w:after="80" w:before="80"/>
+      </w:pPr>
+      <w:r>
+        <w:rPr>
+          <w:rFonts w:ascii="Calibri" w:cs="Calibri" w:eastAsia="Calibri" w:hAnsi="Calibri"/>
+          <w:color w:val="1E293B"/>
+          <w:sz w:val="22"/>
+          <w:szCs w:val="22"/>
+        </w:rPr>
+        <w:t xml:space="preserve">![Sessão de revisão espaçada com flashcard](images/06-review.png)</w:t>
       </w:r>
     </w:p>
     <w:p>
@@ -6874,22 +6856,16 @@
     </w:p>
     <w:p>
       <w:pPr>
-        <w:pBdr>
-          <w:left w:color="7C3AED" w:sz="12" w:space="8"/>
-        </w:pBdr>
-        <w:spacing w:after="120" w:before="120"/>
-        <w:ind w:left="576"/>
-      </w:pPr>
-      <w:r>
-        <w:rPr>
-          <w:rFonts w:ascii="Calibri" w:cs="Calibri" w:eastAsia="Calibri" w:hAnsi="Calibri"/>
-          <w:i/>
-          <w:iCs/>
-          <w:color w:val="64748B"/>
-          <w:sz w:val="22"/>
-          <w:szCs w:val="22"/>
-        </w:rPr>
-        <w:t xml:space="preserve">📸 *[Imagem: Formulário de criação de flashcard com campos Frente e Verso preenchidos]*</w:t>
+        <w:spacing w:after="80" w:before="80"/>
+      </w:pPr>
+      <w:r>
+        <w:rPr>
+          <w:rFonts w:ascii="Calibri" w:cs="Calibri" w:eastAsia="Calibri" w:hAnsi="Calibri"/>
+          <w:color w:val="1E293B"/>
+          <w:sz w:val="22"/>
+          <w:szCs w:val="22"/>
+        </w:rPr>
+        <w:t xml:space="preserve">![Modal de adição de conteúdo e criação de flashcards](images/04-library-modal.png)</w:t>
       </w:r>
     </w:p>
     <w:p>
@@ -7865,22 +7841,16 @@
     </w:p>
     <w:p>
       <w:pPr>
-        <w:pBdr>
-          <w:left w:color="7C3AED" w:sz="12" w:space="8"/>
-        </w:pBdr>
-        <w:spacing w:after="120" w:before="120"/>
-        <w:ind w:left="576"/>
-      </w:pPr>
-      <w:r>
-        <w:rPr>
-          <w:rFonts w:ascii="Calibri" w:cs="Calibri" w:eastAsia="Calibri" w:hAnsi="Calibri"/>
-          <w:i/>
-          <w:iCs/>
-          <w:color w:val="64748B"/>
-          <w:sz w:val="22"/>
-          <w:szCs w:val="22"/>
-        </w:rPr>
-        <w:t xml:space="preserve">📸 *[Imagem: Tela inicial do Aprendizado Ativo com os três modos: Modo Professor, Aplicação Prática e Auto-Avaliação]*</w:t>
+        <w:spacing w:after="80" w:before="80"/>
+      </w:pPr>
+      <w:r>
+        <w:rPr>
+          <w:rFonts w:ascii="Calibri" w:cs="Calibri" w:eastAsia="Calibri" w:hAnsi="Calibri"/>
+          <w:color w:val="1E293B"/>
+          <w:sz w:val="22"/>
+          <w:szCs w:val="22"/>
+        </w:rPr>
+        <w:t xml:space="preserve">![Aprendizado Ativo — Modo Professor, Aplicação Prática e Auto-Avaliação](images/08-active.png)</w:t>
       </w:r>
     </w:p>
     <w:p>
@@ -9660,22 +9630,16 @@
     </w:p>
     <w:p>
       <w:pPr>
-        <w:pBdr>
-          <w:left w:color="7C3AED" w:sz="12" w:space="8"/>
-        </w:pBdr>
-        <w:spacing w:after="120" w:before="120"/>
-        <w:ind w:left="576"/>
-      </w:pPr>
-      <w:r>
-        <w:rPr>
-          <w:rFonts w:ascii="Calibri" w:cs="Calibri" w:eastAsia="Calibri" w:hAnsi="Calibri"/>
-          <w:i/>
-          <w:iCs/>
-          <w:color w:val="64748B"/>
-          <w:sz w:val="22"/>
-          <w:szCs w:val="22"/>
-        </w:rPr>
-        <w:t xml:space="preserve">📸 *[Imagem: Tela de Habilidades com cards de skill por categoria, barra de XP e level]*</w:t>
+        <w:spacing w:after="80" w:before="80"/>
+      </w:pPr>
+      <w:r>
+        <w:rPr>
+          <w:rFonts w:ascii="Calibri" w:cs="Calibri" w:eastAsia="Calibri" w:hAnsi="Calibri"/>
+          <w:color w:val="1E293B"/>
+          <w:sz w:val="22"/>
+          <w:szCs w:val="22"/>
+        </w:rPr>
+        <w:t xml:space="preserve">![Habilidades — progresso, XP e nível por competência](images/09-skills.png)</w:t>
       </w:r>
     </w:p>
     <w:p>

</xml_diff>